<commit_message>
Incorpora la respuesta del experto: fuentes de datos validadas y evaluacion del Top-3 por su aporte a la clasificacion
</commit_message>
<xml_diff>
--- a/proyecto_de_grado/docs/informe_avance/borrador_ajustes_informe_avance.docx
+++ b/proyecto_de_grado/docs/informe_avance/borrador_ajustes_informe_avance.docx
@@ -73,10 +73,10 @@
         <w:rPr>
           <w:rStyle w:val="VerbatimChar"/>
         </w:rPr>
-        <w:t xml:space="preserve">Proyecto_de_grado/spike_enlace_datos/</w:t>
-      </w:r>
-      <w:r>
-        <w:t xml:space="preserve">).</w:t>
+        <w:t xml:space="preserve">proyecto_de_grado/docs/spike_enlace_datos/</w:t>
+      </w:r>
+      <w:r>
+        <w:t xml:space="preserve">). El 7 de octubre se incorporó la respuesta del experto de dominio sobre las fuentes de datos y sobre la recuperación del Top-3.</w:t>
       </w:r>
     </w:p>
     <w:bookmarkStart w:id="18" w:name="Xf265f54d7fce1dc426d3e717fbf72912879af9c"/>
@@ -223,7 +223,7 @@
         <w:t xml:space="preserve">Further Reading</w:t>
       </w:r>
       <w:r>
-        <w:t xml:space="preserve">). Frente a la propuesta, este avance precisa la fuente de texto completo, el protocolo de anotación humana y la definición operativa de las métricas de recuperación.</w:t>
+        <w:t xml:space="preserve">). Frente a la propuesta, este avance precisa la fuente de texto completo, el protocolo de anotación humana y el papel de la recuperación como insumo de la clasificación, con la forma de evaluarla.</w:t>
       </w:r>
     </w:p>
     <w:p>
@@ -283,7 +283,7 @@
         </w:numPr>
       </w:pPr>
       <w:r>
-        <w:t xml:space="preserve">Implementar, antes de finalizar la semana 2, un recuperador denso basado en SciBERT que obtenga los tres fragmentos más cercanos del artículo citado, con Recall@K y MRR reportados frente a BM25.</w:t>
+        <w:t xml:space="preserve">Implementar, antes de finalizar la semana 2, un recuperador denso basado en SciBERT que entregue al clasificador los tres fragmentos más cercanos del artículo citado con su sección, y cuyo aporte se mide por la mejora en F1 Macro frente a clasificar sin fragmentos.</w:t>
       </w:r>
     </w:p>
     <w:p>
@@ -428,17 +428,20 @@
         <w:pStyle w:val="BodyText"/>
       </w:pPr>
       <w:r>
-        <w:t xml:space="preserve">Esta decisión corrige la propuesta, que planteaba el enlace con unarXive por identificador de arXiv. Un estudio sobre 500 contextos aleatorios de ACL-200 (semilla 42) mostró que esa ruta no es viable: solo el 0,2 % de los pares tendría ambos artículos en arXiv, porque el 99,5 % de los artículos citados es anterior a 2015 y fue publicado en ACL Anthology. Con ACL OCL, en cambio, el 82,2 % de los pares queda completo.</w:t>
-      </w:r>
-      <w:r>
-        <w:t xml:space="preserve"> </w:t>
-      </w:r>
-      <w:r>
-        <w:rPr>
-          <w:b/>
-          <w:bCs/>
-        </w:rPr>
-        <w:t xml:space="preserve">[PENDIENTE: confirmación del experto de dominio sobre el uso de ACL OCL.]</w:t>
+        <w:t xml:space="preserve">Esta decisión corrige la propuesta, que planteaba el enlace con unarXive por identificador de arXiv. Un estudio sobre 500 contextos aleatorios de ACL-200 (semilla 42) mostró que esa ruta no es viable: solo el 0,2 % de los pares tendría ambos artículos en arXiv, porque el 99,5 % de los artículos citados es anterior a 2015 y fue publicado en ACL Anthology. Con ACL OCL, en cambio, el 82,2 % de los pares queda completo. El experto de dominio confirmó que el conjunto puede combinar las fuentes que el equipo elija, siempre que cumpla las características del enunciado (texto científico en inglés del área de</w:t>
+      </w:r>
+      <w:r>
+        <w:t xml:space="preserve"> </w:t>
+      </w:r>
+      <w:r>
+        <w:rPr>
+          <w:i/>
+          <w:iCs/>
+        </w:rPr>
+        <w:t xml:space="preserve">Computer Science</w:t>
+      </w:r>
+      <w:r>
+        <w:t xml:space="preserve">) y alcance las cuotas propuestas o se aproxime lo suficiente a ellas.</w:t>
       </w:r>
     </w:p>
     <w:p>
@@ -1428,13 +1431,13 @@
       </w:r>
     </w:p>
     <w:bookmarkEnd w:id="27"/>
-    <w:bookmarkStart w:id="28" w:name="Xe8165b3398501a5c852c0c3e3d41db3c538c93e"/>
+    <w:bookmarkStart w:id="28" w:name="evaluación-de-la-recuperación"/>
     <w:p>
       <w:pPr>
         <w:pStyle w:val="Heading2"/>
       </w:pPr>
       <w:r>
-        <w:t xml:space="preserve">3.4 Definición de las métricas de recuperación</w:t>
+        <w:t xml:space="preserve">3.4 Evaluación de la recuperación</w:t>
       </w:r>
     </w:p>
     <w:p>
@@ -1442,7 +1445,59 @@
         <w:pStyle w:val="FirstParagraph"/>
       </w:pPr>
       <w:r>
-        <w:t xml:space="preserve">Sea</w:t>
+        <w:t xml:space="preserve">La recuperación del Top-3 no es un fin en sí misma: su objetivo es darle al clasificador la información del artículo citado que necesita para decidir la función de la cita. Así lo precisó el experto de dominio, que indicó que esta tarea no exige un cálculo de métricas propio. Por eso la recuperación se evalúa en dos niveles:</w:t>
+      </w:r>
+    </w:p>
+    <w:p>
+      <w:pPr>
+        <w:pStyle w:val="Compact"/>
+        <w:numPr>
+          <w:ilvl w:val="0"/>
+          <w:numId w:val="1007"/>
+        </w:numPr>
+      </w:pPr>
+      <w:r>
+        <w:rPr>
+          <w:b/>
+          <w:bCs/>
+        </w:rPr>
+        <w:t xml:space="preserve">Evaluación principal, por su efecto en la clasificación.</w:t>
+      </w:r>
+      <w:r>
+        <w:t xml:space="preserve"> </w:t>
+      </w:r>
+      <w:r>
+        <w:t xml:space="preserve">Se compara el F1 Macro del clasificador sin fragmentos (C0 y C1) contra el F1 Macro con los fragmentos recuperados (C2), usando el mismo Test Gold. Si C2 no supera a C1, los fragmentos no aportan información útil y se revisa la fragmentación o el recuperador. La misma comparación se hace con los fragmentos de BM25 en lugar de los de SciBERT.</w:t>
+      </w:r>
+    </w:p>
+    <w:p>
+      <w:pPr>
+        <w:pStyle w:val="Compact"/>
+        <w:numPr>
+          <w:ilvl w:val="0"/>
+          <w:numId w:val="1007"/>
+        </w:numPr>
+      </w:pPr>
+      <w:r>
+        <w:rPr>
+          <w:b/>
+          <w:bCs/>
+        </w:rPr>
+        <w:t xml:space="preserve">Evaluación complementaria, sobre un conjunto curado pequeño.</w:t>
+      </w:r>
+      <w:r>
+        <w:t xml:space="preserve"> </w:t>
+      </w:r>
+      <w:r>
+        <w:t xml:space="preserve">Siguiendo la sugerencia del experto, el equipo cura un conjunto de 100 contextos para medir la recuperación de forma directa y ajustar la fragmentación. Ese conjunto también puede servir de ejemplos para los modelos.</w:t>
+      </w:r>
+    </w:p>
+    <w:p>
+      <w:pPr>
+        <w:pStyle w:val="FirstParagraph"/>
+      </w:pPr>
+      <w:r>
+        <w:t xml:space="preserve">En el conjunto curado, sea</w:t>
       </w:r>
       <w:r>
         <w:t xml:space="preserve"> </w:t>
@@ -1456,7 +1511,7 @@
         <w:t xml:space="preserve"> </w:t>
       </w:r>
       <w:r>
-        <w:t xml:space="preserve">el conjunto de contextos evaluados y, para cada contexto</w:t>
+        <w:t xml:space="preserve">el conjunto de contextos y, para cada contexto</w:t>
       </w:r>
       <w:r>
         <w:t xml:space="preserve"> </w:t>
@@ -2024,23 +2079,7 @@
         <w:t xml:space="preserve"> </w:t>
       </w:r>
       <w:r>
-        <w:t xml:space="preserve">ACL-200 no indica qué fragmento del artículo citado respalda cada cita, así que la referencia se construye. Se toman 200 contextos del conjunto de prueba; para cada uno se juntan los diez mejores fragmentos de BM25 y de SciBERT, y dos anotadores marcan cuáles respaldan la afirmación. Juntar los candidatos de ambos sistemas evita que la referencia favorezca a uno de ellos. Los desacuerdos los resuelve un tercero y se reporta el acuerdo.</w:t>
-      </w:r>
-      <w:r>
-        <w:t xml:space="preserve"> </w:t>
-      </w:r>
-      <w:r>
-        <w:rPr>
-          <w:b/>
-          <w:bCs/>
-        </w:rPr>
-        <w:t xml:space="preserve">[PENDIENTE: confirmación del experto sobre esta referencia.]</w:t>
-      </w:r>
-      <w:r>
-        <w:t xml:space="preserve"> </w:t>
-      </w:r>
-      <w:r>
-        <w:t xml:space="preserve">Las diferencias entre sistemas se reportan con intervalos de confianza por</w:t>
+        <w:t xml:space="preserve">ACL-200 no indica qué fragmento del artículo citado respalda cada cita, así que la referencia se construye. Para cada uno de los 100 contextos se juntan los diez mejores fragmentos de BM25 y de SciBERT, y dos anotadores marcan cuáles respaldan la afirmación. Juntar los candidatos de ambos sistemas evita que la referencia favorezca a uno de ellos. Los desacuerdos los resuelve un tercero y se reporta el acuerdo. Las diferencias entre sistemas se reportan con intervalos de confianza por</w:t>
       </w:r>
       <w:r>
         <w:t xml:space="preserve"> </w:t>
@@ -2072,7 +2111,7 @@
         <w:pStyle w:val="Compact"/>
         <w:numPr>
           <w:ilvl w:val="0"/>
-          <w:numId w:val="1007"/>
+          <w:numId w:val="1008"/>
         </w:numPr>
       </w:pPr>
       <w:r>
@@ -2094,7 +2133,7 @@
         <w:pStyle w:val="Compact"/>
         <w:numPr>
           <w:ilvl w:val="0"/>
-          <w:numId w:val="1007"/>
+          <w:numId w:val="1008"/>
         </w:numPr>
       </w:pPr>
       <w:r>
@@ -2116,7 +2155,7 @@
         <w:pStyle w:val="Compact"/>
         <w:numPr>
           <w:ilvl w:val="0"/>
-          <w:numId w:val="1007"/>
+          <w:numId w:val="1008"/>
         </w:numPr>
       </w:pPr>
       <w:r>
@@ -2138,7 +2177,7 @@
         <w:pStyle w:val="Compact"/>
         <w:numPr>
           <w:ilvl w:val="0"/>
-          <w:numId w:val="1007"/>
+          <w:numId w:val="1008"/>
         </w:numPr>
       </w:pPr>
       <w:r>
@@ -2154,7 +2193,7 @@
         <w:pStyle w:val="Compact"/>
         <w:numPr>
           <w:ilvl w:val="0"/>
-          <w:numId w:val="1007"/>
+          <w:numId w:val="1008"/>
         </w:numPr>
       </w:pPr>
       <w:r>
@@ -2162,7 +2201,7 @@
           <w:b/>
           <w:bCs/>
         </w:rPr>
-        <w:t xml:space="preserve">[PENDIENTE: primeras cifras de Recall@K y MRR, y F1 Macro de la línea base de clasificación.]</w:t>
+        <w:t xml:space="preserve">[PENDIENTE: F1 Macro de la línea base de clasificación en las configuraciones C0 a C2, y Recall@3 y MRR sobre el conjunto curado de 100 contextos.]</w:t>
       </w:r>
     </w:p>
     <w:bookmarkEnd w:id="30"/>
@@ -2198,7 +2237,7 @@
         <w:pStyle w:val="Compact"/>
         <w:numPr>
           <w:ilvl w:val="0"/>
-          <w:numId w:val="1008"/>
+          <w:numId w:val="1009"/>
         </w:numPr>
       </w:pPr>
       <w:r>
@@ -2210,7 +2249,7 @@
         <w:pStyle w:val="Compact"/>
         <w:numPr>
           <w:ilvl w:val="0"/>
-          <w:numId w:val="1008"/>
+          <w:numId w:val="1009"/>
         </w:numPr>
       </w:pPr>
       <w:r>
@@ -2222,7 +2261,7 @@
         <w:pStyle w:val="Compact"/>
         <w:numPr>
           <w:ilvl w:val="0"/>
-          <w:numId w:val="1008"/>
+          <w:numId w:val="1009"/>
         </w:numPr>
       </w:pPr>
       <w:r>
@@ -2254,7 +2293,7 @@
         <w:pStyle w:val="Compact"/>
         <w:numPr>
           <w:ilvl w:val="0"/>
-          <w:numId w:val="1009"/>
+          <w:numId w:val="1010"/>
         </w:numPr>
       </w:pPr>
       <w:r>
@@ -2289,7 +2328,7 @@
         <w:pStyle w:val="Compact"/>
         <w:numPr>
           <w:ilvl w:val="0"/>
-          <w:numId w:val="1009"/>
+          <w:numId w:val="1010"/>
         </w:numPr>
       </w:pPr>
       <w:r>
@@ -2311,7 +2350,7 @@
         <w:pStyle w:val="Compact"/>
         <w:numPr>
           <w:ilvl w:val="0"/>
-          <w:numId w:val="1009"/>
+          <w:numId w:val="1010"/>
         </w:numPr>
       </w:pPr>
       <w:r>
@@ -2345,7 +2384,7 @@
         <w:pStyle w:val="Compact"/>
         <w:numPr>
           <w:ilvl w:val="0"/>
-          <w:numId w:val="1010"/>
+          <w:numId w:val="1011"/>
         </w:numPr>
       </w:pPr>
       <w:r>
@@ -2357,7 +2396,7 @@
         <w:pStyle w:val="Compact"/>
         <w:numPr>
           <w:ilvl w:val="0"/>
-          <w:numId w:val="1010"/>
+          <w:numId w:val="1011"/>
         </w:numPr>
       </w:pPr>
       <w:r>
@@ -2369,7 +2408,7 @@
         <w:pStyle w:val="Compact"/>
         <w:numPr>
           <w:ilvl w:val="0"/>
-          <w:numId w:val="1010"/>
+          <w:numId w:val="1011"/>
         </w:numPr>
       </w:pPr>
       <w:r>
@@ -2381,11 +2420,11 @@
         <w:pStyle w:val="Compact"/>
         <w:numPr>
           <w:ilvl w:val="0"/>
-          <w:numId w:val="1010"/>
-        </w:numPr>
-      </w:pPr>
-      <w:r>
-        <w:t xml:space="preserve">Anotar la referencia de recuperación.</w:t>
+          <w:numId w:val="1011"/>
+        </w:numPr>
+      </w:pPr>
+      <w:r>
+        <w:t xml:space="preserve">Curar el conjunto de 100 contextos con los fragmentos que respaldan cada cita.</w:t>
       </w:r>
     </w:p>
     <w:bookmarkEnd w:id="31"/>
@@ -2403,7 +2442,7 @@
         <w:pStyle w:val="Compact"/>
         <w:numPr>
           <w:ilvl w:val="0"/>
-          <w:numId w:val="1011"/>
+          <w:numId w:val="1012"/>
         </w:numPr>
       </w:pPr>
       <w:r>
@@ -2428,7 +2467,7 @@
         <w:pStyle w:val="Compact"/>
         <w:numPr>
           <w:ilvl w:val="0"/>
-          <w:numId w:val="1011"/>
+          <w:numId w:val="1012"/>
         </w:numPr>
       </w:pPr>
       <w:r>
@@ -2456,7 +2495,7 @@
         <w:pStyle w:val="Compact"/>
         <w:numPr>
           <w:ilvl w:val="0"/>
-          <w:numId w:val="1011"/>
+          <w:numId w:val="1012"/>
         </w:numPr>
       </w:pPr>
       <w:r>
@@ -3038,7 +3077,34 @@
     <w:abstractNumId w:val="991"/>
   </w:num>
   <w:num w:numId="1007">
-    <w:abstractNumId w:val="991"/>
+    <w:abstractNumId w:val="99411"/>
+    <w:lvlOverride w:ilvl="0">
+      <w:startOverride w:val="1"/>
+    </w:lvlOverride>
+    <w:lvlOverride w:ilvl="1">
+      <w:startOverride w:val="1"/>
+    </w:lvlOverride>
+    <w:lvlOverride w:ilvl="2">
+      <w:startOverride w:val="1"/>
+    </w:lvlOverride>
+    <w:lvlOverride w:ilvl="3">
+      <w:startOverride w:val="1"/>
+    </w:lvlOverride>
+    <w:lvlOverride w:ilvl="4">
+      <w:startOverride w:val="1"/>
+    </w:lvlOverride>
+    <w:lvlOverride w:ilvl="5">
+      <w:startOverride w:val="1"/>
+    </w:lvlOverride>
+    <w:lvlOverride w:ilvl="6">
+      <w:startOverride w:val="1"/>
+    </w:lvlOverride>
+    <w:lvlOverride w:ilvl="7">
+      <w:startOverride w:val="1"/>
+    </w:lvlOverride>
+    <w:lvlOverride w:ilvl="8">
+      <w:startOverride w:val="1"/>
+    </w:lvlOverride>
   </w:num>
   <w:num w:numId="1008">
     <w:abstractNumId w:val="991"/>
@@ -3047,6 +3113,9 @@
     <w:abstractNumId w:val="991"/>
   </w:num>
   <w:num w:numId="1010">
+    <w:abstractNumId w:val="991"/>
+  </w:num>
+  <w:num w:numId="1011">
     <w:abstractNumId w:val="99411"/>
     <w:lvlOverride w:ilvl="0">
       <w:startOverride w:val="1"/>
@@ -3076,7 +3145,7 @@
       <w:startOverride w:val="1"/>
     </w:lvlOverride>
   </w:num>
-  <w:num w:numId="1011">
+  <w:num w:numId="1012">
     <w:abstractNumId w:val="991"/>
   </w:num>
 </w:numbering>

</xml_diff>